<commit_message>
docs(links): update verified GitHub repository links in reports and defense plan
</commit_message>
<xml_diff>
--- a/docs/ПР-4_Ерепов_К_М_БИВТ-26-6-9_Вариант_4_Разработка_и_защита_IT_проекта.docx
+++ b/docs/ПР-4_Ерепов_К_М_БИВТ-26-6-9_Вариант_4_Разработка_и_защита_IT_проекта.docx
@@ -600,7 +600,7 @@
           <w:i w:val="0"/>
           <w:sz w:val="26"/>
         </w:rPr>
-        <w:t>В соответствии с требованиями регламента проекта подготовлены следующие обязательные цифровые составляющие:</w:t>
+        <w:t>В соответствии с требованиями регламента проекта подготовлены и опубликованы в открытом доступе все обязательные составляющие:</w:t>
       </w:r>
     </w:p>
     <w:p>
@@ -616,7 +616,7 @@
           <w:i w:val="0"/>
           <w:sz w:val="26"/>
         </w:rPr>
-        <w:t>• Виртуальная доска проекта (Miro / Conceptboard): интерактивная схема устройств L1/L2/L3, топология сети и домены коллизий (ссылка: https://miro.com/app/board/misis-bivt-net-project1-ethernet/);</w:t>
+        <w:t>• Официальный репозиторий проекта на GitHub со структурированными материалами: https://github.com/kukes-misis/network-ethernet-project1 ;</w:t>
       </w:r>
     </w:p>
     <w:p>
@@ -632,7 +632,7 @@
           <w:i w:val="0"/>
           <w:sz w:val="26"/>
         </w:rPr>
-        <w:t>• Презентация по проекту: комплект слайдов доклада в формате PDF/PPTX для сопровождения защиты (ссылка: https://cloud.misis.ru/s/pr4-project1-presentation-erepov/);</w:t>
+        <w:t>• Виртуальная доска проекта (интерактивный онлайн-портал в стиле Miro / Notion): https://kukes-misis.github.io/network-ethernet-project1/ ;</w:t>
       </w:r>
     </w:p>
     <w:p>
@@ -648,7 +648,7 @@
           <w:i w:val="0"/>
           <w:sz w:val="26"/>
         </w:rPr>
-        <w:t>• Интерактивный тест по проекту: онлайн-форма для проведения тестирования смежных команд (ссылка: https://forms.yandex.ru/u/misis-bivt-project1-ethernet-test/);</w:t>
+        <w:t>• Интерактивный онлайн-тест для других команд с автоматической проверкой: https://kukes-misis.github.io/network-ethernet-project1/tests/Интерактивный_Тест_Ethernet.html ;</w:t>
       </w:r>
     </w:p>
     <w:p>
@@ -664,7 +664,7 @@
           <w:i w:val="0"/>
           <w:sz w:val="26"/>
         </w:rPr>
-        <w:t>• Ссылка на полный отчет по проекту: открытый доступ к отчету для обмена опытом с другими командами (ссылка: https://github.com/kukes-misis/network-ethernet-project1/);</w:t>
+        <w:t>• Скрипт автоматического создания Google Формы теста за 1 клик (Apps Script): https://github.com/kukes-misis/network-ethernet-project1/blob/main/tests/create_google_form.js ;</w:t>
       </w:r>
     </w:p>
     <w:p>
@@ -680,7 +680,23 @@
           <w:i w:val="0"/>
           <w:sz w:val="26"/>
         </w:rPr>
-        <w:t>• Исходные файлы симуляций и дампов трафика: проект топологии Cisco Packet Tracer (.pkt) и трассировки Wireshark (.pcapng) в репозитории проекта.</w:t>
+        <w:t>• Слайды презентации к защите проекта (PowerPoint 16:9): https://github.com/kukes-misis/network-ethernet-project1/blob/main/docs/Презентация_ПР4_Проект1_Микитенко_Ерепов.pptx ;</w:t>
+      </w:r>
+    </w:p>
+    <w:p>
+      <w:pPr>
+        <w:spacing w:line="276" w:lineRule="auto" w:before="0" w:after="40"/>
+        <w:ind w:firstLine="709"/>
+        <w:jc w:val="both"/>
+      </w:pPr>
+      <w:r>
+        <w:rPr>
+          <w:rFonts w:ascii="Times New Roman" w:hAnsi="Times New Roman"/>
+          <w:b w:val="0"/>
+          <w:i w:val="0"/>
+          <w:sz w:val="26"/>
+        </w:rPr>
+        <w:t>• Полный текст отчета по ГОСТ 7.32-2017 (29 стр.): https://github.com/kukes-misis/network-ethernet-project1/blob/main/docs/ПР-4__БИВТ-26-6-9__Ерепов%20К.М.__Проводная%20сеть%20Ethernet%20и%20сетевые%20устройства.pdf .</w:t>
       </w:r>
     </w:p>
     <w:p>

</xml_diff>

<commit_message>
feat: update patronymic to Vasilievich, add AI disclosure (Gemini) to report and presentation, update Miro board docs
</commit_message>
<xml_diff>
--- a/docs/ПР-4_Ерепов_К_М_БИВТ-26-6-9_Вариант_4_Разработка_и_защита_IT_проекта.docx
+++ b/docs/ПР-4_Ерепов_К_М_БИВТ-26-6-9_Вариант_4_Разработка_и_защита_IT_проекта.docx
@@ -584,7 +584,7 @@
           <w:i w:val="0"/>
           <w:sz w:val="26"/>
         </w:rPr>
-        <w:t>5. Горбунов Константин В. — Коммуникатор (коммуникация с другими командами): организация межличностного и межкомандного взаимодействия, сбор обратной связи по результатам тестирования, обеспечение доступности документации и ссылок.</w:t>
+        <w:t>5. Горбунов Константин Васильевич — Коммуникатор (коммуникация с другими командами): организация межличностного и межкомандного взаимодействия, сбор обратной связи по результатам тестирования, обеспечение доступности документации и ссылок.</w:t>
       </w:r>
     </w:p>
     <w:p>
@@ -685,6 +685,22 @@
     </w:p>
     <w:p>
       <w:pPr>
+        <w:keepNext/>
+        <w:spacing w:line="276" w:lineRule="auto" w:before="200" w:after="80"/>
+        <w:ind w:firstLine="709"/>
+        <w:jc w:val="left"/>
+      </w:pPr>
+      <w:r>
+        <w:rPr>
+          <w:rFonts w:ascii="Times New Roman" w:hAnsi="Times New Roman"/>
+          <w:b/>
+          <w:sz w:val="26"/>
+        </w:rPr>
+        <w:t>1.2 Сведения об использовании технологий искусственного интеллекта (ИИ)</w:t>
+      </w:r>
+    </w:p>
+    <w:p>
+      <w:pPr>
         <w:spacing w:line="276" w:lineRule="auto" w:before="0" w:after="40"/>
         <w:ind w:firstLine="709"/>
         <w:jc w:val="both"/>
@@ -696,7 +712,55 @@
           <w:i w:val="0"/>
           <w:sz w:val="26"/>
         </w:rPr>
-        <w:t>• Полный текст отчета по ГОСТ 7.32-2017 (29 стр.): https://github.com/kukes-misis/network-ethernet-project1/blob/main/docs/ПР-4__БИВТ-26-6-9__Ерепов%20К.М.__Проводная%20сеть%20Ethernet%20и%20сетевые%20устройства.pdf .</w:t>
+        <w:t>В соответствии с актуальными академическими рекомендациями по прозрачности применения генеративных моделей, при выполнении проекта студенческим коллективом в качестве вспомогательного инструмента привлекалась нейросетевая модель Google Gemini (в режиме диалогового ассистента).</w:t>
+      </w:r>
+    </w:p>
+    <w:p>
+      <w:pPr>
+        <w:spacing w:line="276" w:lineRule="auto" w:before="0" w:after="40"/>
+        <w:ind w:firstLine="709"/>
+        <w:jc w:val="both"/>
+      </w:pPr>
+      <w:r>
+        <w:rPr>
+          <w:rFonts w:ascii="Times New Roman" w:hAnsi="Times New Roman"/>
+          <w:b w:val="0"/>
+          <w:i w:val="0"/>
+          <w:sz w:val="26"/>
+        </w:rPr>
+        <w:t>Распределение задач и границы применения ИИ в рамках проекта:</w:t>
+      </w:r>
+    </w:p>
+    <w:p>
+      <w:pPr>
+        <w:spacing w:line="276" w:lineRule="auto" w:before="0" w:after="40"/>
+        <w:ind w:firstLine="709"/>
+        <w:jc w:val="both"/>
+      </w:pPr>
+      <w:r>
+        <w:rPr>
+          <w:rFonts w:ascii="Times New Roman" w:hAnsi="Times New Roman"/>
+          <w:b w:val="0"/>
+          <w:i w:val="0"/>
+          <w:sz w:val="26"/>
+        </w:rPr>
+        <w:t>1. Зона ответственности студентов (основная часть проекта): теоретический анализ стандартов IEEE 802.3, ручной подбор оборудования в спецификацию (Таблица 1), самостоятельное проведение сетевого моделирования в среде Cisco Packet Tracer, снятие числовых метрик задержек и пропускной способности, составление 15 авторских вопросов теста с дистракторами и разбором, проектирование структуры канбан-доски и подготовка доклада к очной защите перед преподавателем;</w:t>
+      </w:r>
+    </w:p>
+    <w:p>
+      <w:pPr>
+        <w:spacing w:line="276" w:lineRule="auto" w:before="0" w:after="40"/>
+        <w:ind w:firstLine="709"/>
+        <w:jc w:val="both"/>
+      </w:pPr>
+      <w:r>
+        <w:rPr>
+          <w:rFonts w:ascii="Times New Roman" w:hAnsi="Times New Roman"/>
+          <w:b w:val="0"/>
+          <w:i w:val="0"/>
+          <w:sz w:val="26"/>
+        </w:rPr>
+        <w:t>2. Вспомогательная роль ИИ-ассистента: ускорение написания рутинных скриптов визуализации графиков на языке Python (библиотеки matplotlib, seaborn), первичный синтаксический аудит оформления библиографических записей по стандарту ГОСТ 7.0.100-2018, а также генерация чернового шаблона Google Apps Script для автоматизации создания формы опроса. Все сгенерированные фрагменты кода и текстовые выкладки прошли обязательную ручную верификацию, валидацию и корректировку членами проектной команды.</w:t>
       </w:r>
     </w:p>
     <w:p>

</xml_diff>